<commit_message>
S1-CL2 AT2: re-point to website, single-template troubleshooting, KE appendix; lab-validated
Rename exemplar dr_implementation->microservice_iac (AT2 implements the microservice + IaC, not DR; DR is planning-only at AT1). Re-point LMS->website; drop 501 KE 6 (now AT1 B15); AWS Academy->Learner Lab.

Single provided data-store template that may not deploy as supplied (planted KeySchema/AttributeDefinitions fault) - replaces the working+broken-copy pair. Region treated as the deploy target, not a template parameter, throughout.

KE moved to a contextual Knowledge Evidence appendix (exemplar Appendix A; assessor benchmark D12), matching AT1; in-body KE tags stripped.

Provided artefacts PROVEN LIVE on the Learner Lab (2026-06-09): broken datastore.yaml fails diagnosably; fixed deploys CREATE_COMPLETE; handler.py validates + writes the audit record end-to-end as LabRole.

Co-Authored-By: Claude Opus 4.8 <noreply@anthropic.com>
</commit_message>
<xml_diff>
--- a/S1-CL2-Cloud-Disaster-Recovery/assessments/AT2/AT2-Microservice-IaC-Implementation-Assessor.docx
+++ b/S1-CL2-Cloud-Disaster-Recovery/assessments/AT2/AT2-Microservice-IaC-Implementation-Assessor.docx
@@ -424,7 +424,7 @@
               <w:pStyle w:val="Assessortext"/>
             </w:pPr>
             <w:r>
-              <w:t>Students are assessed on implementing the audit-log microservice from the YAT LMS Global Expansion design approved at AT1. Working as an MP Tech Solutions (MTS) consultant in the AWS Academy lab, the student OPERATES a provided infrastructure-as-code template for the audit-log data store, AUTHORS and deploys their own infrastructure-as-code template for the microservice (using the supplied code) that writes to that store, configures monitoring, tests and troubleshoots the build, and documents it in a Deployment Report submitted to YAT ICT management for sign-off. This is the implementation phase of the engagement; the design and plan come from AT1.</w:t>
+              <w:t>Students are assessed on implementing the audit-log microservice from the YAT Website Global Expansion design approved at AT1. Working as an MP Tech Solutions (MTS) consultant in the AWS Academy lab, the student OPERATES a provided infrastructure-as-code template for the audit-log data store, AUTHORS and deploys their own infrastructure-as-code template for the microservice (using the supplied code) that writes to that store, configures monitoring, tests and troubleshoots the build, and documents it in a Deployment Report submitted to YAT ICT management for sign-off. This is the implementation phase of the engagement; the design and plan come from AT1.</w:t>
             </w:r>
           </w:p>
         </w:tc>
@@ -471,7 +471,7 @@
               <w:pStyle w:val="Assessortext"/>
             </w:pPr>
             <w:r>
-              <w:t>• Operate the provided data-store template - deploy, confirm, update and delete the supplied DynamoDB audit-store template, and troubleshoot the deliberately broken copy (Appendix A).</w:t>
+              <w:t>• Operate the provided data-store template - deploy, confirm, update and delete the supplied DynamoDB audit-store template, and troubleshoot it if it does not deploy as supplied (Appendix A).</w:t>
             </w:r>
           </w:p>
           <w:p>
@@ -683,7 +683,7 @@
               <w:pStyle w:val="Assessortext"/>
             </w:pPr>
             <w:r>
-              <w:t>• The YAT scenario site / intranet - the LMS Global Expansion project, and the AT1 Solution Design and Disaster Recovery Plan (the approved design this build implements).</w:t>
+              <w:t>• The YAT scenario site / intranet - the Website Global Expansion project, and the AT1 Solution Design and Disaster Recovery Plan (the approved design this build implements).</w:t>
             </w:r>
           </w:p>
           <w:p>
@@ -699,7 +699,7 @@
               <w:pStyle w:val="Assessortext"/>
             </w:pPr>
             <w:r>
-              <w:t>• The AWS Academy lab environment for the build (the specific lab product, and therefore the deployment region, is confirmed and advised before the assessment runs - see Conditions).</w:t>
+              <w:t>• The AWS Academy Learner Lab for the build (the deployment region is confirmed and advised before the assessment runs - see Conditions).</w:t>
             </w:r>
           </w:p>
           <w:p>
@@ -707,7 +707,7 @@
               <w:pStyle w:val="Assessortext"/>
             </w:pPr>
             <w:r>
-              <w:t>• The provided assessment artefacts (Appendices A and B): the data-store infrastructure-as-code template (and a broken copy), the microservice code, and the webhook payload contract.</w:t>
+              <w:t>• The provided assessment artefacts (Appendices A and B): the data-store infrastructure-as-code template, the microservice code, and the webhook payload contract.</w:t>
             </w:r>
           </w:p>
         </w:tc>
@@ -865,19 +865,19 @@
           <w:p>
             <w:pPr/>
             <w:r>
-              <w:t>C2 - AWS Academy lab access is available for the student to build, deploy and test. The specific lab environment (and therefore the deployment region) is TBA - confirmed and advised to students before the assessment runs.</w:t>
+              <w:t>C2 - AWS Academy Learner Lab access is available for the student to build, deploy and test. The deployment region is confirmed and advised to students before the assessment runs.</w:t>
             </w:r>
           </w:p>
           <w:p>
             <w:pPr/>
             <w:r>
-              <w:t>C3 - The assessor supplies the provided artefacts in Appendices A and B: the data-store template (and its broken copy), the microservice code, and the webhook payload contract.</w:t>
+              <w:t>C3 - The assessor supplies the provided artefacts in Appendices A and B: the data-store template, the microservice code, and the webhook payload contract.</w:t>
             </w:r>
           </w:p>
           <w:p>
             <w:pPr/>
             <w:r>
-              <w:t>C4 - Design context: the AT1 design places the audit store in the India region (ap-south-1) for data residency. The deployment region in the lab is the lab environment's (TBA); region is exposed as a template parameter so the same template targets the production region. The mechanics are assessed, not the geography.</w:t>
+              <w:t>C4 - Design context: the AT1 design places the audit store in the India region (ap-south-1) for data residency. The deployment region in the lab is the lab's (advised before the build); the region is the deploy target (the --region flag on the deploy command), not a template parameter, so the same template targets the lab region or production. The mechanics are assessed, not the geography.</w:t>
             </w:r>
           </w:p>
           <w:p>
@@ -1133,7 +1133,7 @@
           </w:tcPr>
           <w:p>
             <w:r>
-              <w:t>D5 - Troubleshooting: diagnoses and fixes the broken provided template and any microservice errors, with a troubleshooting log.</w:t>
+              <w:t>D5 - Troubleshooting: diagnoses and fixes the fault in the provided data-store template (if it does not deploy as supplied) and any microservice errors, with a troubleshooting log.</w:t>
             </w:r>
           </w:p>
         </w:tc>
@@ -1199,7 +1199,7 @@
           </w:tcPr>
           <w:p>
             <w:r>
-              <w:t>D8 - Configuration decisions: states and justifies the implementation decisions (IaC service, datastore, decoupling, compute, region parameterisation).</w:t>
+              <w:t>D8 - Configuration decisions: states and justifies the implementation decisions (IaC service, datastore, decoupling, compute, environment parameterisation).</w:t>
             </w:r>
           </w:p>
         </w:tc>
@@ -1287,7 +1287,7 @@
           </w:tcPr>
           <w:p>
             <w:r>
-              <w:t>D12 - Knowledge Evidence: written contextual responses linking the build to the underlying IaC and microservice concepts (and the shared cloud foundations).</w:t>
+              <w:t>D12 - Knowledge Evidence appendix: written contextual responses, in a Knowledge Evidence appendix, linking the build to the underlying IaC and microservice concepts and the shared cloud foundations.</w:t>
             </w:r>
           </w:p>
         </w:tc>
@@ -1381,7 +1381,7 @@
         <w:pStyle w:val="Assessortext"/>
       </w:pPr>
       <w:r>
-        <w:t>This is the implementation phase of the YAT LMS Global Expansion engagement. The design and disaster recovery plan were produced and approved in AT1; in AT2 you build the audit-log microservice from that design - operating a provided data-store template and authoring your own template for the service - in the AWS Academy lab, and document it in a Deployment Report.</w:t>
+        <w:t>This is the implementation phase of the YAT Website Global Expansion engagement. The design and disaster recovery plan were produced and approved in AT1; in AT2 you build the audit-log microservice from that design - operating a provided data-store template and authoring your own template for the service - in the AWS Academy lab, and document it in a Deployment Report.</w:t>
       </w:r>
     </w:p>
     <w:p>
@@ -1413,7 +1413,7 @@
         <w:pStyle w:val="Assessortext"/>
       </w:pPr>
       <w:r>
-        <w:t>• Operate the provided data-store template (Appendix A) - review it, deploy it, update a setting and redeploy, delete it, and fix the deliberately broken copy.</w:t>
+        <w:t>• Operate the provided data-store template (Appendix A) - review it and deploy it (diagnosing and fixing it first if it does not deploy as supplied), update a setting and redeploy, then delete it.</w:t>
       </w:r>
     </w:p>
     <w:p>
@@ -1421,7 +1421,7 @@
         <w:pStyle w:val="Assessortext"/>
       </w:pPr>
       <w:r>
-        <w:t>• Author your own infrastructure-as-code template for the microservice - provision the API, queue and function, parameterise it (region/environment), wire it to the data-store table, then update/redeploy and remove it.</w:t>
+        <w:t>• Author your own infrastructure-as-code template for the microservice - provision the API, queue and function, parameterise it (e.g. EnvName), wire it to the data-store table, then update/redeploy and remove it.</w:t>
       </w:r>
     </w:p>
     <w:p>
@@ -1445,7 +1445,7 @@
         <w:pStyle w:val="Assessortext"/>
       </w:pPr>
       <w:r>
-        <w:t>Lab environment: the specific AWS Academy lab (and the deployment region) will be advised before you start. The AT1 design places the store in India (ap-south-1) for residency; expose region as a template parameter so the same template targets the lab and the production region.</w:t>
+        <w:t>Lab environment: the AWS Academy Learner Lab (and the deployment region) will be advised before you start. The AT1 design places the store in India (ap-south-1) for residency; the deployment region is the deploy target (the --region flag), so the same template deploys to the lab region or production - parameterise environment-specific values (e.g. EnvName), not the region.</w:t>
       </w:r>
     </w:p>
     <w:p>
@@ -1453,7 +1453,7 @@
         <w:pStyle w:val="Assessortext"/>
       </w:pPr>
       <w:r>
-        <w:t>Complete the Knowledge Evidence responses (contextual short answers about your own build) and attach your evidence - screenshots, the templates, and the test/troubleshooting evidence - in the appendices.</w:t>
+        <w:t>Knowledge Evidence (required). In a Knowledge Evidence appendix of your Deployment Report, answer the following questions in your own words, about your own build:</w:t>
       </w:r>
     </w:p>
     <w:p>
@@ -1461,7 +1461,63 @@
         <w:pStyle w:val="Assessortext"/>
       </w:pPr>
       <w:r>
-        <w:t>AT2 is submitted to the LMS as the populated Deployment Report (.docx) with the templates and evidence appendices completed.</w:t>
+        <w:t>• Why did you use infrastructure as code rather than provisioning by hand?</w:t>
+      </w:r>
+    </w:p>
+    <w:p>
+      <w:pPr>
+        <w:pStyle w:val="Assessortext"/>
+      </w:pPr>
+      <w:r>
+        <w:t>• Which infrastructure-as-code service did you use, what are the main sections of one of your templates, and what tooling deploys it?</w:t>
+      </w:r>
+    </w:p>
+    <w:p>
+      <w:pPr>
+        <w:pStyle w:val="Assessortext"/>
+      </w:pPr>
+      <w:r>
+        <w:t>• How did you parameterise your template so it can be reused across environments, and how does it connect to the provided data store?</w:t>
+      </w:r>
+    </w:p>
+    <w:p>
+      <w:pPr>
+        <w:pStyle w:val="Assessortext"/>
+      </w:pPr>
+      <w:r>
+        <w:t>• How did you test and debug your work - both the templates and the microservice?</w:t>
+      </w:r>
+    </w:p>
+    <w:p>
+      <w:pPr>
+        <w:pStyle w:val="Assessortext"/>
+      </w:pPr>
+      <w:r>
+        <w:t>• Which industry infrastructure-as-code practices did you apply, and what signals or metrics are used to manage templates?</w:t>
+      </w:r>
+    </w:p>
+    <w:p>
+      <w:pPr>
+        <w:pStyle w:val="Assessortext"/>
+      </w:pPr>
+      <w:r>
+        <w:t>• Which industry standards and standard cloud products does your build rely on, and why is your data-store choice appropriate for an append-only audit log?</w:t>
+      </w:r>
+    </w:p>
+    <w:p>
+      <w:pPr>
+        <w:pStyle w:val="Assessortext"/>
+      </w:pPr>
+      <w:r>
+        <w:t>Attach your evidence - screenshots, the templates, and the test/troubleshooting evidence - in the appendices.</w:t>
+      </w:r>
+    </w:p>
+    <w:p>
+      <w:pPr>
+        <w:pStyle w:val="Assessortext"/>
+      </w:pPr>
+      <w:r>
+        <w:t>AT2 is submitted as the populated Deployment Report (.docx) with the templates and evidence appendices completed.</w:t>
       </w:r>
     </w:p>
     <w:p>
@@ -1485,7 +1541,7 @@
         <w:pStyle w:val="Assessortext"/>
       </w:pPr>
       <w:r>
-        <w:t>Operate the provided template fully. The data-store template (Appendix A) is one you operate, not author - show the whole lifecycle: review, deploy, update, delete, and the fix of the broken copy.</w:t>
+        <w:t>Operate the provided template fully. The data-store template (Appendix A) is one you operate, not author - show the whole lifecycle: review, deploy, update, delete - and, if it does not deploy as supplied, the fix too.</w:t>
       </w:r>
     </w:p>
     <w:p>
@@ -1493,7 +1549,7 @@
         <w:pStyle w:val="Assessortext"/>
       </w:pPr>
       <w:r>
-        <w:t>Author your own template for the service. The microservice template is yours - parameterise it (region/environment) and reference the provided table, so it is clearly your own reusable work.</w:t>
+        <w:t>Author your own template for the service. The microservice template is yours - parameterise it (e.g. EnvName) and reference the provided table, so it is clearly your own reusable work.</w:t>
       </w:r>
     </w:p>
     <w:p>
@@ -1561,7 +1617,7 @@
         <w:t xml:space="preserve">D2  -  </w:t>
       </w:r>
       <w:r>
-        <w:t>[ICTCLD505 PC 1.1-1.4] benefits/automation/issues/service selection; [PC 2.1-2.6] template syntax, review, deploy/update/delete, confirm, remove, troubleshoot; [PE 1]; [KE 3, 4, 5, 6, 10]. Assessor note: must show the FULL lifecycle on the PROVIDED template, not just a deploy - a review of its resources/dependencies, an update + redeploy, a delete, and the fixed broken copy.</w:t>
+        <w:t>[ICTCLD505 PC 1.1-1.4] benefits/automation/issues/service selection; [PC 2.1-2.6] template syntax, review, deploy/update/delete, confirm, remove, troubleshoot; [PE 1]. Assessor note: must show the FULL lifecycle on the PROVIDED template, not just a deploy - a review of its resources/dependencies, an update + redeploy, a delete, and - if the supplied template does not deploy - the fix as well.</w:t>
       </w:r>
     </w:p>
     <w:p>
@@ -1575,7 +1631,7 @@
         <w:t xml:space="preserve">D3  -  </w:t>
       </w:r>
       <w:r>
-        <w:t>[ICTCLD505 PC 3.1-3.7] author/deploy/update/parameterise/remove/troubleshoot own template; [PE 2] create, run and update at least one own template; [KE 8, 9]. Assessor note: the student's OWN template is the microservice (API + queue + function), parameterised (e.g. region/environment), and references the provided table (CloudFormation import or a parameter).</w:t>
+        <w:t>[ICTCLD505 PC 3.1-3.7] author/deploy/update/parameterise/remove/troubleshoot own template; [PE 2] create, run and update at least one own template. Assessor note: the student's OWN template is the microservice (API + queue + function), parameterised (e.g. EnvName; the region is the deploy target, not a parameter), and references the provided table (CloudFormation import or a parameter).</w:t>
       </w:r>
     </w:p>
     <w:p>
@@ -1603,7 +1659,7 @@
         <w:t xml:space="preserve">D5  -  </w:t>
       </w:r>
       <w:r>
-        <w:t>[ICTCLD503 PC 3.4] troubleshoot and fix errors; [ICTCLD505 PC 2.6, 3.7] test/troubleshoot template errors; [ICTCLD505 KE 7] / [ICTCLD503 KE 5]. Assessor note: the broken provided template (Appendix A) is diagnosed from the error and fixed; the log shows symptom -&gt; cause -&gt; fix.</w:t>
+        <w:t>[ICTCLD503 PC 3.4] troubleshoot and fix errors; [ICTCLD505 PC 2.6, 3.7] test/troubleshoot template errors. Assessor note: the provided template (Appendix A) does not deploy as supplied; the fault is diagnosed from the error and fixed; the log shows symptom -&gt; cause -&gt; fix.</w:t>
       </w:r>
     </w:p>
     <w:p>
@@ -1617,7 +1673,7 @@
         <w:t xml:space="preserve">D6  -  </w:t>
       </w:r>
       <w:r>
-        <w:t>[ICTCLD503 PC 4.1] set up metrics and trigger scaling alarms; [ICTCLD501 KE 6] techniques and methods to monitor and create alerts. Assessor note: at least one real alarm wired to a notification; a scaling-relevant metric (queue depth, concurrency, or provisioned-capacity utilisation) is the strongest evidence.</w:t>
+        <w:t>[ICTCLD503 PC 4.1] set up metrics and trigger scaling alarms. Assessor note: at least one real alarm wired to a notification; a scaling-relevant metric (queue depth, concurrency, or provisioned-capacity utilisation) is the strongest evidence.</w:t>
       </w:r>
     </w:p>
     <w:p>
@@ -1645,7 +1701,7 @@
         <w:t xml:space="preserve">D8  -  </w:t>
       </w:r>
       <w:r>
-        <w:t>[ICTCLD505 KE 10, 11] methods/metrics to provision and manage templates; configuration choices justified.</w:t>
+        <w:t>Configuration decisions documented and justified in the report (§5); the underlying methods/metrics knowledge ([ICTCLD505 KE 10, 11]) is evidenced in the Knowledge Evidence appendix - see D12.</w:t>
       </w:r>
     </w:p>
     <w:p>
@@ -1701,7 +1757,7 @@
         <w:t xml:space="preserve">D12  -  </w:t>
       </w:r>
       <w:r>
-        <w:t>[ICTCLD505 KE 3-9] IaC concepts; [ICTCLD503 KE 5] testing/debugging; [ICTCLD503 KE 1, 2] / [ICTCLD505 KE 1, 2] industry standards and standard hardware/software/storage.</w:t>
+        <w:t>Written contextual responses in the Knowledge Evidence appendix, each tied to the student's own build: [ICTCLD505 KE 1-11] (IaC concepts, methods/metrics, testing/debugging) + [ICTCLD503 KE 1, 2, 5] (industry standards, standard products, testing/debugging).</w:t>
       </w:r>
     </w:p>
     <w:p>
@@ -1731,7 +1787,15 @@
         <w:pStyle w:val="Assessortext"/>
       </w:pPr>
       <w:r>
-        <w:t>This infrastructure-as-code template is PROVIDED to you. You OPERATE it - you do not author it: review it to see what it creates and its dependencies, deploy it, update a parameter and redeploy, delete it, and fix the broken copy. It creates the DynamoDB table your microservice writes to.</w:t>
+        <w:t>This infrastructure-as-code template is PROVIDED to you. You OPERATE it - you do not author it: review it to see what it creates and its dependencies, deploy it, update a parameter and redeploy, and delete it. It creates the DynamoDB table your microservice writes to.</w:t>
+      </w:r>
+    </w:p>
+    <w:p>
+      <w:pPr>
+        <w:pStyle w:val="Assessortext"/>
+      </w:pPr>
+      <w:r>
+        <w:t>Note: this template may contain a fault and fail to deploy as supplied. If it does, read the error, diagnose and fix the problem, then redeploy - and record the symptom, cause and fix in your troubleshooting log.</w:t>
       </w:r>
     </w:p>
     <w:p>
@@ -1811,19 +1875,19 @@
           <w:rFonts w:ascii="Consolas" w:hAnsi="Consolas"/>
           <w:sz w:val="17"/>
         </w:rPr>
-        <w:t xml:space="preserve">  microservice writes. Operate it: review, deploy, update a parameter, delete,</w:t>
-      </w:r>
-    </w:p>
-    <w:p>
-      <w:pPr>
-        <w:spacing w:after="0" w:before="0"/>
-      </w:pPr>
-      <w:r>
-        <w:rPr>
-          <w:rFonts w:ascii="Consolas" w:hAnsi="Consolas"/>
-          <w:sz w:val="17"/>
-        </w:rPr>
-        <w:t xml:space="preserve">  and fix the broken copy.</w:t>
+        <w:t xml:space="preserve">  microservice writes. Operate it: review, deploy, update a parameter, and delete.</w:t>
+      </w:r>
+    </w:p>
+    <w:p>
+      <w:pPr>
+        <w:spacing w:after="0" w:before="0"/>
+      </w:pPr>
+      <w:r>
+        <w:rPr>
+          <w:rFonts w:ascii="Consolas" w:hAnsi="Consolas"/>
+          <w:sz w:val="17"/>
+        </w:rPr>
+        <w:t xml:space="preserve">  It may not deploy as supplied - if so, diagnose the error, fix it, and redeploy.</w:t>
       </w:r>
     </w:p>
     <w:p>
@@ -2015,7 +2079,7 @@
           <w:rFonts w:ascii="Consolas" w:hAnsi="Consolas"/>
           <w:sz w:val="17"/>
         </w:rPr>
-        <w:t xml:space="preserve">        - { AttributeName: event_id, AttributeType: S }</w:t>
+        <w:t xml:space="preserve">        - { AttributeName: id, AttributeType: S }</w:t>
       </w:r>
     </w:p>
     <w:p>
@@ -2063,7 +2127,7 @@
           <w:rFonts w:ascii="Consolas" w:hAnsi="Consolas"/>
           <w:sz w:val="17"/>
         </w:rPr>
-        <w:t xml:space="preserve">        - { Key: Project, Value: YAT-LMS }</w:t>
+        <w:t xml:space="preserve">        - { Key: Project, Value: YAT-Website }</w:t>
       </w:r>
     </w:p>
     <w:p>
@@ -2176,10 +2240,158 @@
     </w:p>
     <w:p>
       <w:pPr>
+        <w:pStyle w:val="Heading2"/>
+      </w:pPr>
+      <w:r>
+        <w:t>How to operate it (the region will be advised - substitute it for &lt;REGION&gt;):</w:t>
+      </w:r>
+    </w:p>
+    <w:p>
+      <w:pPr>
+        <w:spacing w:after="0" w:before="0"/>
+      </w:pPr>
+      <w:r>
+        <w:rPr>
+          <w:rFonts w:ascii="Consolas" w:hAnsi="Consolas"/>
+          <w:sz w:val="17"/>
+        </w:rPr>
+        <w:t># Review it first: open the file and note the resources it creates and any dependencies.</w:t>
+      </w:r>
+    </w:p>
+    <w:p>
+      <w:pPr>
+        <w:spacing w:after="0" w:before="0"/>
+      </w:pPr>
+      <w:r>
+        <w:rPr>
+          <w:rFonts w:ascii="Consolas" w:hAnsi="Consolas"/>
+          <w:sz w:val="17"/>
+        </w:rPr>
+        <w:t xml:space="preserve"> </w:t>
+      </w:r>
+    </w:p>
+    <w:p>
+      <w:pPr>
+        <w:spacing w:after="0" w:before="0"/>
+      </w:pPr>
+      <w:r>
+        <w:rPr>
+          <w:rFonts w:ascii="Consolas" w:hAnsi="Consolas"/>
+          <w:sz w:val="17"/>
+        </w:rPr>
+        <w:t># Deploy:</w:t>
+      </w:r>
+    </w:p>
+    <w:p>
+      <w:pPr>
+        <w:spacing w:after="0" w:before="0"/>
+      </w:pPr>
+      <w:r>
+        <w:rPr>
+          <w:rFonts w:ascii="Consolas" w:hAnsi="Consolas"/>
+          <w:sz w:val="17"/>
+        </w:rPr>
+        <w:t>aws cloudformation deploy --region &lt;REGION&gt; \</w:t>
+      </w:r>
+    </w:p>
+    <w:p>
+      <w:pPr>
+        <w:spacing w:after="0" w:before="0"/>
+      </w:pPr>
+      <w:r>
+        <w:rPr>
+          <w:rFonts w:ascii="Consolas" w:hAnsi="Consolas"/>
+          <w:sz w:val="17"/>
+        </w:rPr>
+        <w:t xml:space="preserve">  --stack-name yat-audit-store --template-file datastore.yaml \</w:t>
+      </w:r>
+    </w:p>
+    <w:p>
+      <w:pPr>
+        <w:spacing w:after="0" w:before="0"/>
+      </w:pPr>
+      <w:r>
+        <w:rPr>
+          <w:rFonts w:ascii="Consolas" w:hAnsi="Consolas"/>
+          <w:sz w:val="17"/>
+        </w:rPr>
+        <w:t xml:space="preserve">  --parameter-overrides EnvName=dev</w:t>
+      </w:r>
+    </w:p>
+    <w:p>
+      <w:pPr>
+        <w:spacing w:after="0" w:before="0"/>
+      </w:pPr>
+      <w:r>
+        <w:rPr>
+          <w:rFonts w:ascii="Consolas" w:hAnsi="Consolas"/>
+          <w:sz w:val="17"/>
+        </w:rPr>
+        <w:t xml:space="preserve"> </w:t>
+      </w:r>
+    </w:p>
+    <w:p>
+      <w:pPr>
+        <w:spacing w:after="0" w:before="0"/>
+      </w:pPr>
+      <w:r>
+        <w:rPr>
+          <w:rFonts w:ascii="Consolas" w:hAnsi="Consolas"/>
+          <w:sz w:val="17"/>
+        </w:rPr>
+        <w:t># Update (change a parameter, e.g. EnvName=prod) and redeploy the same way; observe the change.</w:t>
+      </w:r>
+    </w:p>
+    <w:p>
+      <w:pPr>
+        <w:spacing w:after="0" w:before="0"/>
+      </w:pPr>
+      <w:r>
+        <w:rPr>
+          <w:rFonts w:ascii="Consolas" w:hAnsi="Consolas"/>
+          <w:sz w:val="17"/>
+        </w:rPr>
+        <w:t xml:space="preserve"> </w:t>
+      </w:r>
+    </w:p>
+    <w:p>
+      <w:pPr>
+        <w:spacing w:after="0" w:before="0"/>
+      </w:pPr>
+      <w:r>
+        <w:rPr>
+          <w:rFonts w:ascii="Consolas" w:hAnsi="Consolas"/>
+          <w:sz w:val="17"/>
+        </w:rPr>
+        <w:t># Confirm in the console or with the CLI, then delete (clean teardown):</w:t>
+      </w:r>
+    </w:p>
+    <w:p>
+      <w:pPr>
+        <w:spacing w:after="0" w:before="0"/>
+      </w:pPr>
+      <w:r>
+        <w:rPr>
+          <w:rFonts w:ascii="Consolas" w:hAnsi="Consolas"/>
+          <w:sz w:val="17"/>
+        </w:rPr>
+        <w:t>aws cloudformation delete-stack --region &lt;REGION&gt; --stack-name yat-audit-store</w:t>
+      </w:r>
+    </w:p>
+    <w:p>
+      <w:pPr>
+        <w:pStyle w:val="Heading1"/>
+      </w:pPr>
+      <w:r>
+        <w:t>Appendix B - Provided microservice code and contract</w:t>
+      </w:r>
+    </w:p>
+    <w:p>
+      <w:pPr>
         <w:pStyle w:val="Assessortext"/>
       </w:pPr>
       <w:r>
-        <w:t>A broken copy (datastore-broken.yaml) is also provided. It contains one deliberate error - deploy or lint it, read the error message, fix it, and redeploy. Record this in your troubleshooting log.</w:t>
+        <w:t>The microservice CODE is PROVIDED to you (you do not write it). You AUTHOR the infrastructure-as-code template that deploys it - the API, the queue, and this function - and wire it to the data-store table from Appendix A. The flow is: HTTP API -&gt; SQS queue -&gt; this function -&gt; the Appendix-A DynamoDB table.</w:t>
       </w:r>
     </w:p>
     <w:p>
@@ -2187,19 +2399,19 @@
         <w:pStyle w:val="Heading2"/>
       </w:pPr>
       <w:r>
-        <w:t>How to operate it (the region will be advised - substitute it for &lt;REGION&gt;):</w:t>
-      </w:r>
-    </w:p>
-    <w:p>
-      <w:pPr>
-        <w:spacing w:after="0" w:before="0"/>
-      </w:pPr>
-      <w:r>
-        <w:rPr>
-          <w:rFonts w:ascii="Consolas" w:hAnsi="Consolas"/>
-          <w:sz w:val="17"/>
-        </w:rPr>
-        <w:t># Review it first: open the file and note the resources it creates and any dependencies.</w:t>
+        <w:t>B.1  Writer function (provided) - handler.py</w:t>
+      </w:r>
+    </w:p>
+    <w:p>
+      <w:pPr>
+        <w:spacing w:after="0" w:before="0"/>
+      </w:pPr>
+      <w:r>
+        <w:rPr>
+          <w:rFonts w:ascii="Consolas" w:hAnsi="Consolas"/>
+          <w:sz w:val="17"/>
+        </w:rPr>
+        <w:t>"""YAT audit-log microservice - SQS-triggered writer Lambda.</w:t>
       </w:r>
     </w:p>
     <w:p>
@@ -2223,43 +2435,31 @@
           <w:rFonts w:ascii="Consolas" w:hAnsi="Consolas"/>
           <w:sz w:val="17"/>
         </w:rPr>
-        <w:t># Deploy:</w:t>
-      </w:r>
-    </w:p>
-    <w:p>
-      <w:pPr>
-        <w:spacing w:after="0" w:before="0"/>
-      </w:pPr>
-      <w:r>
-        <w:rPr>
-          <w:rFonts w:ascii="Consolas" w:hAnsi="Consolas"/>
-          <w:sz w:val="17"/>
-        </w:rPr>
-        <w:t>aws cloudformation deploy --region &lt;REGION&gt; \</w:t>
-      </w:r>
-    </w:p>
-    <w:p>
-      <w:pPr>
-        <w:spacing w:after="0" w:before="0"/>
-      </w:pPr>
-      <w:r>
-        <w:rPr>
-          <w:rFonts w:ascii="Consolas" w:hAnsi="Consolas"/>
-          <w:sz w:val="17"/>
-        </w:rPr>
-        <w:t xml:space="preserve">  --stack-name yat-audit-store --template-file datastore.yaml \</w:t>
-      </w:r>
-    </w:p>
-    <w:p>
-      <w:pPr>
-        <w:spacing w:after="0" w:before="0"/>
-      </w:pPr>
-      <w:r>
-        <w:rPr>
-          <w:rFonts w:ascii="Consolas" w:hAnsi="Consolas"/>
-          <w:sz w:val="17"/>
-        </w:rPr>
-        <w:t xml:space="preserve">  --parameter-overrides EnvName=dev</w:t>
+        <w:t>Reads access-event messages from the SQS queue and appends each as an immutable</w:t>
+      </w:r>
+    </w:p>
+    <w:p>
+      <w:pPr>
+        <w:spacing w:after="0" w:before="0"/>
+      </w:pPr>
+      <w:r>
+        <w:rPr>
+          <w:rFonts w:ascii="Consolas" w:hAnsi="Consolas"/>
+          <w:sz w:val="17"/>
+        </w:rPr>
+        <w:t>audit record to the DynamoDB table. Idempotent: event_id is the partition key and a</w:t>
+      </w:r>
+    </w:p>
+    <w:p>
+      <w:pPr>
+        <w:spacing w:after="0" w:before="0"/>
+      </w:pPr>
+      <w:r>
+        <w:rPr>
+          <w:rFonts w:ascii="Consolas" w:hAnsi="Consolas"/>
+          <w:sz w:val="17"/>
+        </w:rPr>
+        <w:t>conditional put means a re-delivered message is skipped rather than duplicated.</w:t>
       </w:r>
     </w:p>
     <w:p>
@@ -2283,7 +2483,7 @@
           <w:rFonts w:ascii="Consolas" w:hAnsi="Consolas"/>
           <w:sz w:val="17"/>
         </w:rPr>
-        <w:t># Update (change a parameter, e.g. EnvName=prod) and redeploy the same way; observe the change.</w:t>
+        <w:t>Data flow:  HTTP API  -&gt;  SQS  -&gt;  (this Lambda)  -&gt;  DynamoDB</w:t>
       </w:r>
     </w:p>
     <w:p>
@@ -2307,27 +2507,711 @@
           <w:rFonts w:ascii="Consolas" w:hAnsi="Consolas"/>
           <w:sz w:val="17"/>
         </w:rPr>
-        <w:t># Confirm in the console or with the CLI, then delete (clean teardown):</w:t>
-      </w:r>
-    </w:p>
-    <w:p>
-      <w:pPr>
-        <w:spacing w:after="0" w:before="0"/>
-      </w:pPr>
-      <w:r>
-        <w:rPr>
-          <w:rFonts w:ascii="Consolas" w:hAnsi="Consolas"/>
-          <w:sz w:val="17"/>
-        </w:rPr>
-        <w:t>aws cloudformation delete-stack --region &lt;REGION&gt; --stack-name yat-audit-store</w:t>
-      </w:r>
-    </w:p>
-    <w:p>
-      <w:pPr>
-        <w:pStyle w:val="Heading1"/>
-      </w:pPr>
-      <w:r>
-        <w:t>Appendix B - Provided microservice code and contract</w:t>
+        <w:t>Runtime: python3.12 (boto3 is provided by the Lambda runtime - no dependencies to package).</w:t>
+      </w:r>
+    </w:p>
+    <w:p>
+      <w:pPr>
+        <w:spacing w:after="0" w:before="0"/>
+      </w:pPr>
+      <w:r>
+        <w:rPr>
+          <w:rFonts w:ascii="Consolas" w:hAnsi="Consolas"/>
+          <w:sz w:val="17"/>
+        </w:rPr>
+        <w:t>Environment:</w:t>
+      </w:r>
+    </w:p>
+    <w:p>
+      <w:pPr>
+        <w:spacing w:after="0" w:before="0"/>
+      </w:pPr>
+      <w:r>
+        <w:rPr>
+          <w:rFonts w:ascii="Consolas" w:hAnsi="Consolas"/>
+          <w:sz w:val="17"/>
+        </w:rPr>
+        <w:t xml:space="preserve">    AUDIT_TABLE   the DynamoDB table name (set by the CloudFormation stack).</w:t>
+      </w:r>
+    </w:p>
+    <w:p>
+      <w:pPr>
+        <w:spacing w:after="0" w:before="0"/>
+      </w:pPr>
+      <w:r>
+        <w:rPr>
+          <w:rFonts w:ascii="Consolas" w:hAnsi="Consolas"/>
+          <w:sz w:val="17"/>
+        </w:rPr>
+        <w:t>"""</w:t>
+      </w:r>
+    </w:p>
+    <w:p>
+      <w:pPr>
+        <w:spacing w:after="0" w:before="0"/>
+      </w:pPr>
+      <w:r>
+        <w:rPr>
+          <w:rFonts w:ascii="Consolas" w:hAnsi="Consolas"/>
+          <w:sz w:val="17"/>
+        </w:rPr>
+        <w:t>import json</w:t>
+      </w:r>
+    </w:p>
+    <w:p>
+      <w:pPr>
+        <w:spacing w:after="0" w:before="0"/>
+      </w:pPr>
+      <w:r>
+        <w:rPr>
+          <w:rFonts w:ascii="Consolas" w:hAnsi="Consolas"/>
+          <w:sz w:val="17"/>
+        </w:rPr>
+        <w:t>import os</w:t>
+      </w:r>
+    </w:p>
+    <w:p>
+      <w:pPr>
+        <w:spacing w:after="0" w:before="0"/>
+      </w:pPr>
+      <w:r>
+        <w:rPr>
+          <w:rFonts w:ascii="Consolas" w:hAnsi="Consolas"/>
+          <w:sz w:val="17"/>
+        </w:rPr>
+        <w:t xml:space="preserve"> </w:t>
+      </w:r>
+    </w:p>
+    <w:p>
+      <w:pPr>
+        <w:spacing w:after="0" w:before="0"/>
+      </w:pPr>
+      <w:r>
+        <w:rPr>
+          <w:rFonts w:ascii="Consolas" w:hAnsi="Consolas"/>
+          <w:sz w:val="17"/>
+        </w:rPr>
+        <w:t>import boto3</w:t>
+      </w:r>
+    </w:p>
+    <w:p>
+      <w:pPr>
+        <w:spacing w:after="0" w:before="0"/>
+      </w:pPr>
+      <w:r>
+        <w:rPr>
+          <w:rFonts w:ascii="Consolas" w:hAnsi="Consolas"/>
+          <w:sz w:val="17"/>
+        </w:rPr>
+        <w:t>from botocore.exceptions import ClientError</w:t>
+      </w:r>
+    </w:p>
+    <w:p>
+      <w:pPr>
+        <w:spacing w:after="0" w:before="0"/>
+      </w:pPr>
+      <w:r>
+        <w:rPr>
+          <w:rFonts w:ascii="Consolas" w:hAnsi="Consolas"/>
+          <w:sz w:val="17"/>
+        </w:rPr>
+        <w:t xml:space="preserve"> </w:t>
+      </w:r>
+    </w:p>
+    <w:p>
+      <w:pPr>
+        <w:spacing w:after="0" w:before="0"/>
+      </w:pPr>
+      <w:r>
+        <w:rPr>
+          <w:rFonts w:ascii="Consolas" w:hAnsi="Consolas"/>
+          <w:sz w:val="17"/>
+        </w:rPr>
+        <w:t>VALID_COHORTS = {"AU", "IN"}</w:t>
+      </w:r>
+    </w:p>
+    <w:p>
+      <w:pPr>
+        <w:spacing w:after="0" w:before="0"/>
+      </w:pPr>
+      <w:r>
+        <w:rPr>
+          <w:rFonts w:ascii="Consolas" w:hAnsi="Consolas"/>
+          <w:sz w:val="17"/>
+        </w:rPr>
+        <w:t>VALID_EVENT_TYPES = {"login", "course_access", "assessment_view"}</w:t>
+      </w:r>
+    </w:p>
+    <w:p>
+      <w:pPr>
+        <w:spacing w:after="0" w:before="0"/>
+      </w:pPr>
+      <w:r>
+        <w:rPr>
+          <w:rFonts w:ascii="Consolas" w:hAnsi="Consolas"/>
+          <w:sz w:val="17"/>
+        </w:rPr>
+        <w:t>REQUIRED_FIELDS = ("event_id", "occurred_at", "user_ref", "cohort", "event_type", "source_ip")</w:t>
+      </w:r>
+    </w:p>
+    <w:p>
+      <w:pPr>
+        <w:spacing w:after="0" w:before="0"/>
+      </w:pPr>
+      <w:r>
+        <w:rPr>
+          <w:rFonts w:ascii="Consolas" w:hAnsi="Consolas"/>
+          <w:sz w:val="17"/>
+        </w:rPr>
+        <w:t xml:space="preserve"> </w:t>
+      </w:r>
+    </w:p>
+    <w:p>
+      <w:pPr>
+        <w:spacing w:after="0" w:before="0"/>
+      </w:pPr>
+      <w:r>
+        <w:rPr>
+          <w:rFonts w:ascii="Consolas" w:hAnsi="Consolas"/>
+          <w:sz w:val="17"/>
+        </w:rPr>
+        <w:t xml:space="preserve"> </w:t>
+      </w:r>
+    </w:p>
+    <w:p>
+      <w:pPr>
+        <w:spacing w:after="0" w:before="0"/>
+      </w:pPr>
+      <w:r>
+        <w:rPr>
+          <w:rFonts w:ascii="Consolas" w:hAnsi="Consolas"/>
+          <w:sz w:val="17"/>
+        </w:rPr>
+        <w:t>def _validate(record):</w:t>
+      </w:r>
+    </w:p>
+    <w:p>
+      <w:pPr>
+        <w:spacing w:after="0" w:before="0"/>
+      </w:pPr>
+      <w:r>
+        <w:rPr>
+          <w:rFonts w:ascii="Consolas" w:hAnsi="Consolas"/>
+          <w:sz w:val="17"/>
+        </w:rPr>
+        <w:t xml:space="preserve">    """Return (ok, reason). Rejects anything that isn't a well-formed access event."""</w:t>
+      </w:r>
+    </w:p>
+    <w:p>
+      <w:pPr>
+        <w:spacing w:after="0" w:before="0"/>
+      </w:pPr>
+      <w:r>
+        <w:rPr>
+          <w:rFonts w:ascii="Consolas" w:hAnsi="Consolas"/>
+          <w:sz w:val="17"/>
+        </w:rPr>
+        <w:t xml:space="preserve">    for field in REQUIRED_FIELDS:</w:t>
+      </w:r>
+    </w:p>
+    <w:p>
+      <w:pPr>
+        <w:spacing w:after="0" w:before="0"/>
+      </w:pPr>
+      <w:r>
+        <w:rPr>
+          <w:rFonts w:ascii="Consolas" w:hAnsi="Consolas"/>
+          <w:sz w:val="17"/>
+        </w:rPr>
+        <w:t xml:space="preserve">        if not record.get(field):</w:t>
+      </w:r>
+    </w:p>
+    <w:p>
+      <w:pPr>
+        <w:spacing w:after="0" w:before="0"/>
+      </w:pPr>
+      <w:r>
+        <w:rPr>
+          <w:rFonts w:ascii="Consolas" w:hAnsi="Consolas"/>
+          <w:sz w:val="17"/>
+        </w:rPr>
+        <w:t xml:space="preserve">            return False, f"missing required field: {field}"</w:t>
+      </w:r>
+    </w:p>
+    <w:p>
+      <w:pPr>
+        <w:spacing w:after="0" w:before="0"/>
+      </w:pPr>
+      <w:r>
+        <w:rPr>
+          <w:rFonts w:ascii="Consolas" w:hAnsi="Consolas"/>
+          <w:sz w:val="17"/>
+        </w:rPr>
+        <w:t xml:space="preserve">    if record["cohort"] not in VALID_COHORTS:</w:t>
+      </w:r>
+    </w:p>
+    <w:p>
+      <w:pPr>
+        <w:spacing w:after="0" w:before="0"/>
+      </w:pPr>
+      <w:r>
+        <w:rPr>
+          <w:rFonts w:ascii="Consolas" w:hAnsi="Consolas"/>
+          <w:sz w:val="17"/>
+        </w:rPr>
+        <w:t xml:space="preserve">        return False, f"invalid cohort: {record['cohort']}"</w:t>
+      </w:r>
+    </w:p>
+    <w:p>
+      <w:pPr>
+        <w:spacing w:after="0" w:before="0"/>
+      </w:pPr>
+      <w:r>
+        <w:rPr>
+          <w:rFonts w:ascii="Consolas" w:hAnsi="Consolas"/>
+          <w:sz w:val="17"/>
+        </w:rPr>
+        <w:t xml:space="preserve">    if record["event_type"] not in VALID_EVENT_TYPES:</w:t>
+      </w:r>
+    </w:p>
+    <w:p>
+      <w:pPr>
+        <w:spacing w:after="0" w:before="0"/>
+      </w:pPr>
+      <w:r>
+        <w:rPr>
+          <w:rFonts w:ascii="Consolas" w:hAnsi="Consolas"/>
+          <w:sz w:val="17"/>
+        </w:rPr>
+        <w:t xml:space="preserve">        return False, f"invalid event_type: {record['event_type']}"</w:t>
+      </w:r>
+    </w:p>
+    <w:p>
+      <w:pPr>
+        <w:spacing w:after="0" w:before="0"/>
+      </w:pPr>
+      <w:r>
+        <w:rPr>
+          <w:rFonts w:ascii="Consolas" w:hAnsi="Consolas"/>
+          <w:sz w:val="17"/>
+        </w:rPr>
+        <w:t xml:space="preserve">    return True, ""</w:t>
+      </w:r>
+    </w:p>
+    <w:p>
+      <w:pPr>
+        <w:spacing w:after="0" w:before="0"/>
+      </w:pPr>
+      <w:r>
+        <w:rPr>
+          <w:rFonts w:ascii="Consolas" w:hAnsi="Consolas"/>
+          <w:sz w:val="17"/>
+        </w:rPr>
+        <w:t xml:space="preserve"> </w:t>
+      </w:r>
+    </w:p>
+    <w:p>
+      <w:pPr>
+        <w:spacing w:after="0" w:before="0"/>
+      </w:pPr>
+      <w:r>
+        <w:rPr>
+          <w:rFonts w:ascii="Consolas" w:hAnsi="Consolas"/>
+          <w:sz w:val="17"/>
+        </w:rPr>
+        <w:t xml:space="preserve"> </w:t>
+      </w:r>
+    </w:p>
+    <w:p>
+      <w:pPr>
+        <w:spacing w:after="0" w:before="0"/>
+      </w:pPr>
+      <w:r>
+        <w:rPr>
+          <w:rFonts w:ascii="Consolas" w:hAnsi="Consolas"/>
+          <w:sz w:val="17"/>
+        </w:rPr>
+        <w:t>def handler(event, context=None):</w:t>
+      </w:r>
+    </w:p>
+    <w:p>
+      <w:pPr>
+        <w:spacing w:after="0" w:before="0"/>
+      </w:pPr>
+      <w:r>
+        <w:rPr>
+          <w:rFonts w:ascii="Consolas" w:hAnsi="Consolas"/>
+          <w:sz w:val="17"/>
+        </w:rPr>
+        <w:t xml:space="preserve">    """SQS event handler. Returns a small summary (and logs it) for observability."""</w:t>
+      </w:r>
+    </w:p>
+    <w:p>
+      <w:pPr>
+        <w:spacing w:after="0" w:before="0"/>
+      </w:pPr>
+      <w:r>
+        <w:rPr>
+          <w:rFonts w:ascii="Consolas" w:hAnsi="Consolas"/>
+          <w:sz w:val="17"/>
+        </w:rPr>
+        <w:t xml:space="preserve">    table = boto3.resource("dynamodb").Table(os.environ.get("AUDIT_TABLE", "yat-audit-log"))</w:t>
+      </w:r>
+    </w:p>
+    <w:p>
+      <w:pPr>
+        <w:spacing w:after="0" w:before="0"/>
+      </w:pPr>
+      <w:r>
+        <w:rPr>
+          <w:rFonts w:ascii="Consolas" w:hAnsi="Consolas"/>
+          <w:sz w:val="17"/>
+        </w:rPr>
+        <w:t xml:space="preserve">    processed = skipped = rejected = 0</w:t>
+      </w:r>
+    </w:p>
+    <w:p>
+      <w:pPr>
+        <w:spacing w:after="0" w:before="0"/>
+      </w:pPr>
+      <w:r>
+        <w:rPr>
+          <w:rFonts w:ascii="Consolas" w:hAnsi="Consolas"/>
+          <w:sz w:val="17"/>
+        </w:rPr>
+        <w:t xml:space="preserve"> </w:t>
+      </w:r>
+    </w:p>
+    <w:p>
+      <w:pPr>
+        <w:spacing w:after="0" w:before="0"/>
+      </w:pPr>
+      <w:r>
+        <w:rPr>
+          <w:rFonts w:ascii="Consolas" w:hAnsi="Consolas"/>
+          <w:sz w:val="17"/>
+        </w:rPr>
+        <w:t xml:space="preserve">    for message in event.get("Records", []):</w:t>
+      </w:r>
+    </w:p>
+    <w:p>
+      <w:pPr>
+        <w:spacing w:after="0" w:before="0"/>
+      </w:pPr>
+      <w:r>
+        <w:rPr>
+          <w:rFonts w:ascii="Consolas" w:hAnsi="Consolas"/>
+          <w:sz w:val="17"/>
+        </w:rPr>
+        <w:t xml:space="preserve">        try:</w:t>
+      </w:r>
+    </w:p>
+    <w:p>
+      <w:pPr>
+        <w:spacing w:after="0" w:before="0"/>
+      </w:pPr>
+      <w:r>
+        <w:rPr>
+          <w:rFonts w:ascii="Consolas" w:hAnsi="Consolas"/>
+          <w:sz w:val="17"/>
+        </w:rPr>
+        <w:t xml:space="preserve">            body = json.loads(message["body"])</w:t>
+      </w:r>
+    </w:p>
+    <w:p>
+      <w:pPr>
+        <w:spacing w:after="0" w:before="0"/>
+      </w:pPr>
+      <w:r>
+        <w:rPr>
+          <w:rFonts w:ascii="Consolas" w:hAnsi="Consolas"/>
+          <w:sz w:val="17"/>
+        </w:rPr>
+        <w:t xml:space="preserve">        except (KeyError, json.JSONDecodeError):</w:t>
+      </w:r>
+    </w:p>
+    <w:p>
+      <w:pPr>
+        <w:spacing w:after="0" w:before="0"/>
+      </w:pPr>
+      <w:r>
+        <w:rPr>
+          <w:rFonts w:ascii="Consolas" w:hAnsi="Consolas"/>
+          <w:sz w:val="17"/>
+        </w:rPr>
+        <w:t xml:space="preserve">            rejected += 1</w:t>
+      </w:r>
+    </w:p>
+    <w:p>
+      <w:pPr>
+        <w:spacing w:after="0" w:before="0"/>
+      </w:pPr>
+      <w:r>
+        <w:rPr>
+          <w:rFonts w:ascii="Consolas" w:hAnsi="Consolas"/>
+          <w:sz w:val="17"/>
+        </w:rPr>
+        <w:t xml:space="preserve">            print("reject: message body is not valid JSON")</w:t>
+      </w:r>
+    </w:p>
+    <w:p>
+      <w:pPr>
+        <w:spacing w:after="0" w:before="0"/>
+      </w:pPr>
+      <w:r>
+        <w:rPr>
+          <w:rFonts w:ascii="Consolas" w:hAnsi="Consolas"/>
+          <w:sz w:val="17"/>
+        </w:rPr>
+        <w:t xml:space="preserve">            continue</w:t>
+      </w:r>
+    </w:p>
+    <w:p>
+      <w:pPr>
+        <w:spacing w:after="0" w:before="0"/>
+      </w:pPr>
+      <w:r>
+        <w:rPr>
+          <w:rFonts w:ascii="Consolas" w:hAnsi="Consolas"/>
+          <w:sz w:val="17"/>
+        </w:rPr>
+        <w:t xml:space="preserve"> </w:t>
+      </w:r>
+    </w:p>
+    <w:p>
+      <w:pPr>
+        <w:spacing w:after="0" w:before="0"/>
+      </w:pPr>
+      <w:r>
+        <w:rPr>
+          <w:rFonts w:ascii="Consolas" w:hAnsi="Consolas"/>
+          <w:sz w:val="17"/>
+        </w:rPr>
+        <w:t xml:space="preserve">        ok, reason = _validate(body)</w:t>
+      </w:r>
+    </w:p>
+    <w:p>
+      <w:pPr>
+        <w:spacing w:after="0" w:before="0"/>
+      </w:pPr>
+      <w:r>
+        <w:rPr>
+          <w:rFonts w:ascii="Consolas" w:hAnsi="Consolas"/>
+          <w:sz w:val="17"/>
+        </w:rPr>
+        <w:t xml:space="preserve">        if not ok:</w:t>
+      </w:r>
+    </w:p>
+    <w:p>
+      <w:pPr>
+        <w:spacing w:after="0" w:before="0"/>
+      </w:pPr>
+      <w:r>
+        <w:rPr>
+          <w:rFonts w:ascii="Consolas" w:hAnsi="Consolas"/>
+          <w:sz w:val="17"/>
+        </w:rPr>
+        <w:t xml:space="preserve">            rejected += 1</w:t>
+      </w:r>
+    </w:p>
+    <w:p>
+      <w:pPr>
+        <w:spacing w:after="0" w:before="0"/>
+      </w:pPr>
+      <w:r>
+        <w:rPr>
+          <w:rFonts w:ascii="Consolas" w:hAnsi="Consolas"/>
+          <w:sz w:val="17"/>
+        </w:rPr>
+        <w:t xml:space="preserve">            print(f"reject: {reason}")</w:t>
+      </w:r>
+    </w:p>
+    <w:p>
+      <w:pPr>
+        <w:spacing w:after="0" w:before="0"/>
+      </w:pPr>
+      <w:r>
+        <w:rPr>
+          <w:rFonts w:ascii="Consolas" w:hAnsi="Consolas"/>
+          <w:sz w:val="17"/>
+        </w:rPr>
+        <w:t xml:space="preserve">            continue</w:t>
+      </w:r>
+    </w:p>
+    <w:p>
+      <w:pPr>
+        <w:spacing w:after="0" w:before="0"/>
+      </w:pPr>
+      <w:r>
+        <w:rPr>
+          <w:rFonts w:ascii="Consolas" w:hAnsi="Consolas"/>
+          <w:sz w:val="17"/>
+        </w:rPr>
+        <w:t xml:space="preserve"> </w:t>
+      </w:r>
+    </w:p>
+    <w:p>
+      <w:pPr>
+        <w:spacing w:after="0" w:before="0"/>
+      </w:pPr>
+      <w:r>
+        <w:rPr>
+          <w:rFonts w:ascii="Consolas" w:hAnsi="Consolas"/>
+          <w:sz w:val="17"/>
+        </w:rPr>
+        <w:t xml:space="preserve">        item = {field: body[field] for field in REQUIRED_FIELDS}</w:t>
+      </w:r>
+    </w:p>
+    <w:p>
+      <w:pPr>
+        <w:spacing w:after="0" w:before="0"/>
+      </w:pPr>
+      <w:r>
+        <w:rPr>
+          <w:rFonts w:ascii="Consolas" w:hAnsi="Consolas"/>
+          <w:sz w:val="17"/>
+        </w:rPr>
+        <w:t xml:space="preserve">        try:</w:t>
+      </w:r>
+    </w:p>
+    <w:p>
+      <w:pPr>
+        <w:spacing w:after="0" w:before="0"/>
+      </w:pPr>
+      <w:r>
+        <w:rPr>
+          <w:rFonts w:ascii="Consolas" w:hAnsi="Consolas"/>
+          <w:sz w:val="17"/>
+        </w:rPr>
+        <w:t xml:space="preserve">            table.put_item(Item=item, ConditionExpression="attribute_not_exists(event_id)")</w:t>
+      </w:r>
+    </w:p>
+    <w:p>
+      <w:pPr>
+        <w:spacing w:after="0" w:before="0"/>
+      </w:pPr>
+      <w:r>
+        <w:rPr>
+          <w:rFonts w:ascii="Consolas" w:hAnsi="Consolas"/>
+          <w:sz w:val="17"/>
+        </w:rPr>
+        <w:t xml:space="preserve">            processed += 1</w:t>
+      </w:r>
+    </w:p>
+    <w:p>
+      <w:pPr>
+        <w:spacing w:after="0" w:before="0"/>
+      </w:pPr>
+      <w:r>
+        <w:rPr>
+          <w:rFonts w:ascii="Consolas" w:hAnsi="Consolas"/>
+          <w:sz w:val="17"/>
+        </w:rPr>
+        <w:t xml:space="preserve">        except ClientError as exc:</w:t>
+      </w:r>
+    </w:p>
+    <w:p>
+      <w:pPr>
+        <w:spacing w:after="0" w:before="0"/>
+      </w:pPr>
+      <w:r>
+        <w:rPr>
+          <w:rFonts w:ascii="Consolas" w:hAnsi="Consolas"/>
+          <w:sz w:val="17"/>
+        </w:rPr>
+        <w:t xml:space="preserve">            if exc.response["Error"]["Code"] == "ConditionalCheckFailedException":</w:t>
+      </w:r>
+    </w:p>
+    <w:p>
+      <w:pPr>
+        <w:spacing w:after="0" w:before="0"/>
+      </w:pPr>
+      <w:r>
+        <w:rPr>
+          <w:rFonts w:ascii="Consolas" w:hAnsi="Consolas"/>
+          <w:sz w:val="17"/>
+        </w:rPr>
+        <w:t xml:space="preserve">                skipped += 1  # already written - idempotent re-delivery</w:t>
+      </w:r>
+    </w:p>
+    <w:p>
+      <w:pPr>
+        <w:spacing w:after="0" w:before="0"/>
+      </w:pPr>
+      <w:r>
+        <w:rPr>
+          <w:rFonts w:ascii="Consolas" w:hAnsi="Consolas"/>
+          <w:sz w:val="17"/>
+        </w:rPr>
+        <w:t xml:space="preserve">            else:</w:t>
+      </w:r>
+    </w:p>
+    <w:p>
+      <w:pPr>
+        <w:spacing w:after="0" w:before="0"/>
+      </w:pPr>
+      <w:r>
+        <w:rPr>
+          <w:rFonts w:ascii="Consolas" w:hAnsi="Consolas"/>
+          <w:sz w:val="17"/>
+        </w:rPr>
+        <w:t xml:space="preserve">                raise  # a real failure: let SQS retry / send to the DLQ</w:t>
+      </w:r>
+    </w:p>
+    <w:p>
+      <w:pPr>
+        <w:spacing w:after="0" w:before="0"/>
+      </w:pPr>
+      <w:r>
+        <w:rPr>
+          <w:rFonts w:ascii="Consolas" w:hAnsi="Consolas"/>
+          <w:sz w:val="17"/>
+        </w:rPr>
+        <w:t xml:space="preserve"> </w:t>
+      </w:r>
+    </w:p>
+    <w:p>
+      <w:pPr>
+        <w:spacing w:after="0" w:before="0"/>
+      </w:pPr>
+      <w:r>
+        <w:rPr>
+          <w:rFonts w:ascii="Consolas" w:hAnsi="Consolas"/>
+          <w:sz w:val="17"/>
+        </w:rPr>
+        <w:t xml:space="preserve">    summary = {"processed": processed, "skipped": skipped, "rejected": rejected}</w:t>
+      </w:r>
+    </w:p>
+    <w:p>
+      <w:pPr>
+        <w:spacing w:after="0" w:before="0"/>
+      </w:pPr>
+      <w:r>
+        <w:rPr>
+          <w:rFonts w:ascii="Consolas" w:hAnsi="Consolas"/>
+          <w:sz w:val="17"/>
+        </w:rPr>
+        <w:t xml:space="preserve">    print(json.dumps(summary))</w:t>
+      </w:r>
+    </w:p>
+    <w:p>
+      <w:pPr>
+        <w:spacing w:after="0" w:before="0"/>
+      </w:pPr>
+      <w:r>
+        <w:rPr>
+          <w:rFonts w:ascii="Consolas" w:hAnsi="Consolas"/>
+          <w:sz w:val="17"/>
+        </w:rPr>
+        <w:t xml:space="preserve">    return summary</w:t>
+      </w:r>
+    </w:p>
+    <w:p>
+      <w:pPr>
+        <w:pStyle w:val="Heading2"/>
+      </w:pPr>
+      <w:r>
+        <w:t>B.2  Webhook contract</w:t>
       </w:r>
     </w:p>
     <w:p>
@@ -2335,835 +3219,7 @@
         <w:pStyle w:val="Assessortext"/>
       </w:pPr>
       <w:r>
-        <w:t>The microservice CODE is PROVIDED to you (you do not write it). You AUTHOR the infrastructure-as-code template that deploys it - the API, the queue, and this function - and wire it to the data-store table from Appendix A. The flow is: HTTP API -&gt; SQS queue -&gt; this function -&gt; the Appendix-A DynamoDB table.</w:t>
-      </w:r>
-    </w:p>
-    <w:p>
-      <w:pPr>
-        <w:pStyle w:val="Heading2"/>
-      </w:pPr>
-      <w:r>
-        <w:t>B.1  Writer function (provided) - handler.py</w:t>
-      </w:r>
-    </w:p>
-    <w:p>
-      <w:pPr>
-        <w:spacing w:after="0" w:before="0"/>
-      </w:pPr>
-      <w:r>
-        <w:rPr>
-          <w:rFonts w:ascii="Consolas" w:hAnsi="Consolas"/>
-          <w:sz w:val="17"/>
-        </w:rPr>
-        <w:t>"""YAT audit-log microservice - SQS-triggered writer Lambda.</w:t>
-      </w:r>
-    </w:p>
-    <w:p>
-      <w:pPr>
-        <w:spacing w:after="0" w:before="0"/>
-      </w:pPr>
-      <w:r>
-        <w:rPr>
-          <w:rFonts w:ascii="Consolas" w:hAnsi="Consolas"/>
-          <w:sz w:val="17"/>
-        </w:rPr>
-        <w:t xml:space="preserve"> </w:t>
-      </w:r>
-    </w:p>
-    <w:p>
-      <w:pPr>
-        <w:spacing w:after="0" w:before="0"/>
-      </w:pPr>
-      <w:r>
-        <w:rPr>
-          <w:rFonts w:ascii="Consolas" w:hAnsi="Consolas"/>
-          <w:sz w:val="17"/>
-        </w:rPr>
-        <w:t>Reads access-event messages from the SQS queue and appends each as an immutable</w:t>
-      </w:r>
-    </w:p>
-    <w:p>
-      <w:pPr>
-        <w:spacing w:after="0" w:before="0"/>
-      </w:pPr>
-      <w:r>
-        <w:rPr>
-          <w:rFonts w:ascii="Consolas" w:hAnsi="Consolas"/>
-          <w:sz w:val="17"/>
-        </w:rPr>
-        <w:t>audit record to the DynamoDB table. Idempotent: event_id is the partition key and a</w:t>
-      </w:r>
-    </w:p>
-    <w:p>
-      <w:pPr>
-        <w:spacing w:after="0" w:before="0"/>
-      </w:pPr>
-      <w:r>
-        <w:rPr>
-          <w:rFonts w:ascii="Consolas" w:hAnsi="Consolas"/>
-          <w:sz w:val="17"/>
-        </w:rPr>
-        <w:t>conditional put means a re-delivered message is skipped rather than duplicated.</w:t>
-      </w:r>
-    </w:p>
-    <w:p>
-      <w:pPr>
-        <w:spacing w:after="0" w:before="0"/>
-      </w:pPr>
-      <w:r>
-        <w:rPr>
-          <w:rFonts w:ascii="Consolas" w:hAnsi="Consolas"/>
-          <w:sz w:val="17"/>
-        </w:rPr>
-        <w:t xml:space="preserve"> </w:t>
-      </w:r>
-    </w:p>
-    <w:p>
-      <w:pPr>
-        <w:spacing w:after="0" w:before="0"/>
-      </w:pPr>
-      <w:r>
-        <w:rPr>
-          <w:rFonts w:ascii="Consolas" w:hAnsi="Consolas"/>
-          <w:sz w:val="17"/>
-        </w:rPr>
-        <w:t>Data flow:  HTTP API  -&gt;  SQS  -&gt;  (this Lambda)  -&gt;  DynamoDB</w:t>
-      </w:r>
-    </w:p>
-    <w:p>
-      <w:pPr>
-        <w:spacing w:after="0" w:before="0"/>
-      </w:pPr>
-      <w:r>
-        <w:rPr>
-          <w:rFonts w:ascii="Consolas" w:hAnsi="Consolas"/>
-          <w:sz w:val="17"/>
-        </w:rPr>
-        <w:t xml:space="preserve"> </w:t>
-      </w:r>
-    </w:p>
-    <w:p>
-      <w:pPr>
-        <w:spacing w:after="0" w:before="0"/>
-      </w:pPr>
-      <w:r>
-        <w:rPr>
-          <w:rFonts w:ascii="Consolas" w:hAnsi="Consolas"/>
-          <w:sz w:val="17"/>
-        </w:rPr>
-        <w:t>Runtime: python3.12 (boto3 is provided by the Lambda runtime - no dependencies to package).</w:t>
-      </w:r>
-    </w:p>
-    <w:p>
-      <w:pPr>
-        <w:spacing w:after="0" w:before="0"/>
-      </w:pPr>
-      <w:r>
-        <w:rPr>
-          <w:rFonts w:ascii="Consolas" w:hAnsi="Consolas"/>
-          <w:sz w:val="17"/>
-        </w:rPr>
-        <w:t>Environment:</w:t>
-      </w:r>
-    </w:p>
-    <w:p>
-      <w:pPr>
-        <w:spacing w:after="0" w:before="0"/>
-      </w:pPr>
-      <w:r>
-        <w:rPr>
-          <w:rFonts w:ascii="Consolas" w:hAnsi="Consolas"/>
-          <w:sz w:val="17"/>
-        </w:rPr>
-        <w:t xml:space="preserve">    AUDIT_TABLE   the DynamoDB table name (set by the CloudFormation stack).</w:t>
-      </w:r>
-    </w:p>
-    <w:p>
-      <w:pPr>
-        <w:spacing w:after="0" w:before="0"/>
-      </w:pPr>
-      <w:r>
-        <w:rPr>
-          <w:rFonts w:ascii="Consolas" w:hAnsi="Consolas"/>
-          <w:sz w:val="17"/>
-        </w:rPr>
-        <w:t>"""</w:t>
-      </w:r>
-    </w:p>
-    <w:p>
-      <w:pPr>
-        <w:spacing w:after="0" w:before="0"/>
-      </w:pPr>
-      <w:r>
-        <w:rPr>
-          <w:rFonts w:ascii="Consolas" w:hAnsi="Consolas"/>
-          <w:sz w:val="17"/>
-        </w:rPr>
-        <w:t>import json</w:t>
-      </w:r>
-    </w:p>
-    <w:p>
-      <w:pPr>
-        <w:spacing w:after="0" w:before="0"/>
-      </w:pPr>
-      <w:r>
-        <w:rPr>
-          <w:rFonts w:ascii="Consolas" w:hAnsi="Consolas"/>
-          <w:sz w:val="17"/>
-        </w:rPr>
-        <w:t>import os</w:t>
-      </w:r>
-    </w:p>
-    <w:p>
-      <w:pPr>
-        <w:spacing w:after="0" w:before="0"/>
-      </w:pPr>
-      <w:r>
-        <w:rPr>
-          <w:rFonts w:ascii="Consolas" w:hAnsi="Consolas"/>
-          <w:sz w:val="17"/>
-        </w:rPr>
-        <w:t xml:space="preserve"> </w:t>
-      </w:r>
-    </w:p>
-    <w:p>
-      <w:pPr>
-        <w:spacing w:after="0" w:before="0"/>
-      </w:pPr>
-      <w:r>
-        <w:rPr>
-          <w:rFonts w:ascii="Consolas" w:hAnsi="Consolas"/>
-          <w:sz w:val="17"/>
-        </w:rPr>
-        <w:t>import boto3</w:t>
-      </w:r>
-    </w:p>
-    <w:p>
-      <w:pPr>
-        <w:spacing w:after="0" w:before="0"/>
-      </w:pPr>
-      <w:r>
-        <w:rPr>
-          <w:rFonts w:ascii="Consolas" w:hAnsi="Consolas"/>
-          <w:sz w:val="17"/>
-        </w:rPr>
-        <w:t>from botocore.exceptions import ClientError</w:t>
-      </w:r>
-    </w:p>
-    <w:p>
-      <w:pPr>
-        <w:spacing w:after="0" w:before="0"/>
-      </w:pPr>
-      <w:r>
-        <w:rPr>
-          <w:rFonts w:ascii="Consolas" w:hAnsi="Consolas"/>
-          <w:sz w:val="17"/>
-        </w:rPr>
-        <w:t xml:space="preserve"> </w:t>
-      </w:r>
-    </w:p>
-    <w:p>
-      <w:pPr>
-        <w:spacing w:after="0" w:before="0"/>
-      </w:pPr>
-      <w:r>
-        <w:rPr>
-          <w:rFonts w:ascii="Consolas" w:hAnsi="Consolas"/>
-          <w:sz w:val="17"/>
-        </w:rPr>
-        <w:t>VALID_COHORTS = {"AU", "IN"}</w:t>
-      </w:r>
-    </w:p>
-    <w:p>
-      <w:pPr>
-        <w:spacing w:after="0" w:before="0"/>
-      </w:pPr>
-      <w:r>
-        <w:rPr>
-          <w:rFonts w:ascii="Consolas" w:hAnsi="Consolas"/>
-          <w:sz w:val="17"/>
-        </w:rPr>
-        <w:t>VALID_EVENT_TYPES = {"login", "course_access", "assessment_view"}</w:t>
-      </w:r>
-    </w:p>
-    <w:p>
-      <w:pPr>
-        <w:spacing w:after="0" w:before="0"/>
-      </w:pPr>
-      <w:r>
-        <w:rPr>
-          <w:rFonts w:ascii="Consolas" w:hAnsi="Consolas"/>
-          <w:sz w:val="17"/>
-        </w:rPr>
-        <w:t>REQUIRED_FIELDS = ("event_id", "occurred_at", "user_ref", "cohort", "event_type", "source_ip")</w:t>
-      </w:r>
-    </w:p>
-    <w:p>
-      <w:pPr>
-        <w:spacing w:after="0" w:before="0"/>
-      </w:pPr>
-      <w:r>
-        <w:rPr>
-          <w:rFonts w:ascii="Consolas" w:hAnsi="Consolas"/>
-          <w:sz w:val="17"/>
-        </w:rPr>
-        <w:t xml:space="preserve"> </w:t>
-      </w:r>
-    </w:p>
-    <w:p>
-      <w:pPr>
-        <w:spacing w:after="0" w:before="0"/>
-      </w:pPr>
-      <w:r>
-        <w:rPr>
-          <w:rFonts w:ascii="Consolas" w:hAnsi="Consolas"/>
-          <w:sz w:val="17"/>
-        </w:rPr>
-        <w:t xml:space="preserve"> </w:t>
-      </w:r>
-    </w:p>
-    <w:p>
-      <w:pPr>
-        <w:spacing w:after="0" w:before="0"/>
-      </w:pPr>
-      <w:r>
-        <w:rPr>
-          <w:rFonts w:ascii="Consolas" w:hAnsi="Consolas"/>
-          <w:sz w:val="17"/>
-        </w:rPr>
-        <w:t>def _validate(record):</w:t>
-      </w:r>
-    </w:p>
-    <w:p>
-      <w:pPr>
-        <w:spacing w:after="0" w:before="0"/>
-      </w:pPr>
-      <w:r>
-        <w:rPr>
-          <w:rFonts w:ascii="Consolas" w:hAnsi="Consolas"/>
-          <w:sz w:val="17"/>
-        </w:rPr>
-        <w:t xml:space="preserve">    """Return (ok, reason). Rejects anything that isn't a well-formed access event."""</w:t>
-      </w:r>
-    </w:p>
-    <w:p>
-      <w:pPr>
-        <w:spacing w:after="0" w:before="0"/>
-      </w:pPr>
-      <w:r>
-        <w:rPr>
-          <w:rFonts w:ascii="Consolas" w:hAnsi="Consolas"/>
-          <w:sz w:val="17"/>
-        </w:rPr>
-        <w:t xml:space="preserve">    for field in REQUIRED_FIELDS:</w:t>
-      </w:r>
-    </w:p>
-    <w:p>
-      <w:pPr>
-        <w:spacing w:after="0" w:before="0"/>
-      </w:pPr>
-      <w:r>
-        <w:rPr>
-          <w:rFonts w:ascii="Consolas" w:hAnsi="Consolas"/>
-          <w:sz w:val="17"/>
-        </w:rPr>
-        <w:t xml:space="preserve">        if not record.get(field):</w:t>
-      </w:r>
-    </w:p>
-    <w:p>
-      <w:pPr>
-        <w:spacing w:after="0" w:before="0"/>
-      </w:pPr>
-      <w:r>
-        <w:rPr>
-          <w:rFonts w:ascii="Consolas" w:hAnsi="Consolas"/>
-          <w:sz w:val="17"/>
-        </w:rPr>
-        <w:t xml:space="preserve">            return False, f"missing required field: {field}"</w:t>
-      </w:r>
-    </w:p>
-    <w:p>
-      <w:pPr>
-        <w:spacing w:after="0" w:before="0"/>
-      </w:pPr>
-      <w:r>
-        <w:rPr>
-          <w:rFonts w:ascii="Consolas" w:hAnsi="Consolas"/>
-          <w:sz w:val="17"/>
-        </w:rPr>
-        <w:t xml:space="preserve">    if record["cohort"] not in VALID_COHORTS:</w:t>
-      </w:r>
-    </w:p>
-    <w:p>
-      <w:pPr>
-        <w:spacing w:after="0" w:before="0"/>
-      </w:pPr>
-      <w:r>
-        <w:rPr>
-          <w:rFonts w:ascii="Consolas" w:hAnsi="Consolas"/>
-          <w:sz w:val="17"/>
-        </w:rPr>
-        <w:t xml:space="preserve">        return False, f"invalid cohort: {record['cohort']}"</w:t>
-      </w:r>
-    </w:p>
-    <w:p>
-      <w:pPr>
-        <w:spacing w:after="0" w:before="0"/>
-      </w:pPr>
-      <w:r>
-        <w:rPr>
-          <w:rFonts w:ascii="Consolas" w:hAnsi="Consolas"/>
-          <w:sz w:val="17"/>
-        </w:rPr>
-        <w:t xml:space="preserve">    if record["event_type"] not in VALID_EVENT_TYPES:</w:t>
-      </w:r>
-    </w:p>
-    <w:p>
-      <w:pPr>
-        <w:spacing w:after="0" w:before="0"/>
-      </w:pPr>
-      <w:r>
-        <w:rPr>
-          <w:rFonts w:ascii="Consolas" w:hAnsi="Consolas"/>
-          <w:sz w:val="17"/>
-        </w:rPr>
-        <w:t xml:space="preserve">        return False, f"invalid event_type: {record['event_type']}"</w:t>
-      </w:r>
-    </w:p>
-    <w:p>
-      <w:pPr>
-        <w:spacing w:after="0" w:before="0"/>
-      </w:pPr>
-      <w:r>
-        <w:rPr>
-          <w:rFonts w:ascii="Consolas" w:hAnsi="Consolas"/>
-          <w:sz w:val="17"/>
-        </w:rPr>
-        <w:t xml:space="preserve">    return True, ""</w:t>
-      </w:r>
-    </w:p>
-    <w:p>
-      <w:pPr>
-        <w:spacing w:after="0" w:before="0"/>
-      </w:pPr>
-      <w:r>
-        <w:rPr>
-          <w:rFonts w:ascii="Consolas" w:hAnsi="Consolas"/>
-          <w:sz w:val="17"/>
-        </w:rPr>
-        <w:t xml:space="preserve"> </w:t>
-      </w:r>
-    </w:p>
-    <w:p>
-      <w:pPr>
-        <w:spacing w:after="0" w:before="0"/>
-      </w:pPr>
-      <w:r>
-        <w:rPr>
-          <w:rFonts w:ascii="Consolas" w:hAnsi="Consolas"/>
-          <w:sz w:val="17"/>
-        </w:rPr>
-        <w:t xml:space="preserve"> </w:t>
-      </w:r>
-    </w:p>
-    <w:p>
-      <w:pPr>
-        <w:spacing w:after="0" w:before="0"/>
-      </w:pPr>
-      <w:r>
-        <w:rPr>
-          <w:rFonts w:ascii="Consolas" w:hAnsi="Consolas"/>
-          <w:sz w:val="17"/>
-        </w:rPr>
-        <w:t>def handler(event, context=None):</w:t>
-      </w:r>
-    </w:p>
-    <w:p>
-      <w:pPr>
-        <w:spacing w:after="0" w:before="0"/>
-      </w:pPr>
-      <w:r>
-        <w:rPr>
-          <w:rFonts w:ascii="Consolas" w:hAnsi="Consolas"/>
-          <w:sz w:val="17"/>
-        </w:rPr>
-        <w:t xml:space="preserve">    """SQS event handler. Returns a small summary (and logs it) for observability."""</w:t>
-      </w:r>
-    </w:p>
-    <w:p>
-      <w:pPr>
-        <w:spacing w:after="0" w:before="0"/>
-      </w:pPr>
-      <w:r>
-        <w:rPr>
-          <w:rFonts w:ascii="Consolas" w:hAnsi="Consolas"/>
-          <w:sz w:val="17"/>
-        </w:rPr>
-        <w:t xml:space="preserve">    table = boto3.resource("dynamodb").Table(os.environ.get("AUDIT_TABLE", "yat-audit-log"))</w:t>
-      </w:r>
-    </w:p>
-    <w:p>
-      <w:pPr>
-        <w:spacing w:after="0" w:before="0"/>
-      </w:pPr>
-      <w:r>
-        <w:rPr>
-          <w:rFonts w:ascii="Consolas" w:hAnsi="Consolas"/>
-          <w:sz w:val="17"/>
-        </w:rPr>
-        <w:t xml:space="preserve">    processed = skipped = rejected = 0</w:t>
-      </w:r>
-    </w:p>
-    <w:p>
-      <w:pPr>
-        <w:spacing w:after="0" w:before="0"/>
-      </w:pPr>
-      <w:r>
-        <w:rPr>
-          <w:rFonts w:ascii="Consolas" w:hAnsi="Consolas"/>
-          <w:sz w:val="17"/>
-        </w:rPr>
-        <w:t xml:space="preserve"> </w:t>
-      </w:r>
-    </w:p>
-    <w:p>
-      <w:pPr>
-        <w:spacing w:after="0" w:before="0"/>
-      </w:pPr>
-      <w:r>
-        <w:rPr>
-          <w:rFonts w:ascii="Consolas" w:hAnsi="Consolas"/>
-          <w:sz w:val="17"/>
-        </w:rPr>
-        <w:t xml:space="preserve">    for message in event.get("Records", []):</w:t>
-      </w:r>
-    </w:p>
-    <w:p>
-      <w:pPr>
-        <w:spacing w:after="0" w:before="0"/>
-      </w:pPr>
-      <w:r>
-        <w:rPr>
-          <w:rFonts w:ascii="Consolas" w:hAnsi="Consolas"/>
-          <w:sz w:val="17"/>
-        </w:rPr>
-        <w:t xml:space="preserve">        try:</w:t>
-      </w:r>
-    </w:p>
-    <w:p>
-      <w:pPr>
-        <w:spacing w:after="0" w:before="0"/>
-      </w:pPr>
-      <w:r>
-        <w:rPr>
-          <w:rFonts w:ascii="Consolas" w:hAnsi="Consolas"/>
-          <w:sz w:val="17"/>
-        </w:rPr>
-        <w:t xml:space="preserve">            body = json.loads(message["body"])</w:t>
-      </w:r>
-    </w:p>
-    <w:p>
-      <w:pPr>
-        <w:spacing w:after="0" w:before="0"/>
-      </w:pPr>
-      <w:r>
-        <w:rPr>
-          <w:rFonts w:ascii="Consolas" w:hAnsi="Consolas"/>
-          <w:sz w:val="17"/>
-        </w:rPr>
-        <w:t xml:space="preserve">        except (KeyError, json.JSONDecodeError):</w:t>
-      </w:r>
-    </w:p>
-    <w:p>
-      <w:pPr>
-        <w:spacing w:after="0" w:before="0"/>
-      </w:pPr>
-      <w:r>
-        <w:rPr>
-          <w:rFonts w:ascii="Consolas" w:hAnsi="Consolas"/>
-          <w:sz w:val="17"/>
-        </w:rPr>
-        <w:t xml:space="preserve">            rejected += 1</w:t>
-      </w:r>
-    </w:p>
-    <w:p>
-      <w:pPr>
-        <w:spacing w:after="0" w:before="0"/>
-      </w:pPr>
-      <w:r>
-        <w:rPr>
-          <w:rFonts w:ascii="Consolas" w:hAnsi="Consolas"/>
-          <w:sz w:val="17"/>
-        </w:rPr>
-        <w:t xml:space="preserve">            print("reject: message body is not valid JSON")</w:t>
-      </w:r>
-    </w:p>
-    <w:p>
-      <w:pPr>
-        <w:spacing w:after="0" w:before="0"/>
-      </w:pPr>
-      <w:r>
-        <w:rPr>
-          <w:rFonts w:ascii="Consolas" w:hAnsi="Consolas"/>
-          <w:sz w:val="17"/>
-        </w:rPr>
-        <w:t xml:space="preserve">            continue</w:t>
-      </w:r>
-    </w:p>
-    <w:p>
-      <w:pPr>
-        <w:spacing w:after="0" w:before="0"/>
-      </w:pPr>
-      <w:r>
-        <w:rPr>
-          <w:rFonts w:ascii="Consolas" w:hAnsi="Consolas"/>
-          <w:sz w:val="17"/>
-        </w:rPr>
-        <w:t xml:space="preserve"> </w:t>
-      </w:r>
-    </w:p>
-    <w:p>
-      <w:pPr>
-        <w:spacing w:after="0" w:before="0"/>
-      </w:pPr>
-      <w:r>
-        <w:rPr>
-          <w:rFonts w:ascii="Consolas" w:hAnsi="Consolas"/>
-          <w:sz w:val="17"/>
-        </w:rPr>
-        <w:t xml:space="preserve">        ok, reason = _validate(body)</w:t>
-      </w:r>
-    </w:p>
-    <w:p>
-      <w:pPr>
-        <w:spacing w:after="0" w:before="0"/>
-      </w:pPr>
-      <w:r>
-        <w:rPr>
-          <w:rFonts w:ascii="Consolas" w:hAnsi="Consolas"/>
-          <w:sz w:val="17"/>
-        </w:rPr>
-        <w:t xml:space="preserve">        if not ok:</w:t>
-      </w:r>
-    </w:p>
-    <w:p>
-      <w:pPr>
-        <w:spacing w:after="0" w:before="0"/>
-      </w:pPr>
-      <w:r>
-        <w:rPr>
-          <w:rFonts w:ascii="Consolas" w:hAnsi="Consolas"/>
-          <w:sz w:val="17"/>
-        </w:rPr>
-        <w:t xml:space="preserve">            rejected += 1</w:t>
-      </w:r>
-    </w:p>
-    <w:p>
-      <w:pPr>
-        <w:spacing w:after="0" w:before="0"/>
-      </w:pPr>
-      <w:r>
-        <w:rPr>
-          <w:rFonts w:ascii="Consolas" w:hAnsi="Consolas"/>
-          <w:sz w:val="17"/>
-        </w:rPr>
-        <w:t xml:space="preserve">            print(f"reject: {reason}")</w:t>
-      </w:r>
-    </w:p>
-    <w:p>
-      <w:pPr>
-        <w:spacing w:after="0" w:before="0"/>
-      </w:pPr>
-      <w:r>
-        <w:rPr>
-          <w:rFonts w:ascii="Consolas" w:hAnsi="Consolas"/>
-          <w:sz w:val="17"/>
-        </w:rPr>
-        <w:t xml:space="preserve">            continue</w:t>
-      </w:r>
-    </w:p>
-    <w:p>
-      <w:pPr>
-        <w:spacing w:after="0" w:before="0"/>
-      </w:pPr>
-      <w:r>
-        <w:rPr>
-          <w:rFonts w:ascii="Consolas" w:hAnsi="Consolas"/>
-          <w:sz w:val="17"/>
-        </w:rPr>
-        <w:t xml:space="preserve"> </w:t>
-      </w:r>
-    </w:p>
-    <w:p>
-      <w:pPr>
-        <w:spacing w:after="0" w:before="0"/>
-      </w:pPr>
-      <w:r>
-        <w:rPr>
-          <w:rFonts w:ascii="Consolas" w:hAnsi="Consolas"/>
-          <w:sz w:val="17"/>
-        </w:rPr>
-        <w:t xml:space="preserve">        item = {field: body[field] for field in REQUIRED_FIELDS}</w:t>
-      </w:r>
-    </w:p>
-    <w:p>
-      <w:pPr>
-        <w:spacing w:after="0" w:before="0"/>
-      </w:pPr>
-      <w:r>
-        <w:rPr>
-          <w:rFonts w:ascii="Consolas" w:hAnsi="Consolas"/>
-          <w:sz w:val="17"/>
-        </w:rPr>
-        <w:t xml:space="preserve">        try:</w:t>
-      </w:r>
-    </w:p>
-    <w:p>
-      <w:pPr>
-        <w:spacing w:after="0" w:before="0"/>
-      </w:pPr>
-      <w:r>
-        <w:rPr>
-          <w:rFonts w:ascii="Consolas" w:hAnsi="Consolas"/>
-          <w:sz w:val="17"/>
-        </w:rPr>
-        <w:t xml:space="preserve">            table.put_item(Item=item, ConditionExpression="attribute_not_exists(event_id)")</w:t>
-      </w:r>
-    </w:p>
-    <w:p>
-      <w:pPr>
-        <w:spacing w:after="0" w:before="0"/>
-      </w:pPr>
-      <w:r>
-        <w:rPr>
-          <w:rFonts w:ascii="Consolas" w:hAnsi="Consolas"/>
-          <w:sz w:val="17"/>
-        </w:rPr>
-        <w:t xml:space="preserve">            processed += 1</w:t>
-      </w:r>
-    </w:p>
-    <w:p>
-      <w:pPr>
-        <w:spacing w:after="0" w:before="0"/>
-      </w:pPr>
-      <w:r>
-        <w:rPr>
-          <w:rFonts w:ascii="Consolas" w:hAnsi="Consolas"/>
-          <w:sz w:val="17"/>
-        </w:rPr>
-        <w:t xml:space="preserve">        except ClientError as exc:</w:t>
-      </w:r>
-    </w:p>
-    <w:p>
-      <w:pPr>
-        <w:spacing w:after="0" w:before="0"/>
-      </w:pPr>
-      <w:r>
-        <w:rPr>
-          <w:rFonts w:ascii="Consolas" w:hAnsi="Consolas"/>
-          <w:sz w:val="17"/>
-        </w:rPr>
-        <w:t xml:space="preserve">            if exc.response["Error"]["Code"] == "ConditionalCheckFailedException":</w:t>
-      </w:r>
-    </w:p>
-    <w:p>
-      <w:pPr>
-        <w:spacing w:after="0" w:before="0"/>
-      </w:pPr>
-      <w:r>
-        <w:rPr>
-          <w:rFonts w:ascii="Consolas" w:hAnsi="Consolas"/>
-          <w:sz w:val="17"/>
-        </w:rPr>
-        <w:t xml:space="preserve">                skipped += 1  # already written - idempotent re-delivery</w:t>
-      </w:r>
-    </w:p>
-    <w:p>
-      <w:pPr>
-        <w:spacing w:after="0" w:before="0"/>
-      </w:pPr>
-      <w:r>
-        <w:rPr>
-          <w:rFonts w:ascii="Consolas" w:hAnsi="Consolas"/>
-          <w:sz w:val="17"/>
-        </w:rPr>
-        <w:t xml:space="preserve">            else:</w:t>
-      </w:r>
-    </w:p>
-    <w:p>
-      <w:pPr>
-        <w:spacing w:after="0" w:before="0"/>
-      </w:pPr>
-      <w:r>
-        <w:rPr>
-          <w:rFonts w:ascii="Consolas" w:hAnsi="Consolas"/>
-          <w:sz w:val="17"/>
-        </w:rPr>
-        <w:t xml:space="preserve">                raise  # a real failure: let SQS retry / send to the DLQ</w:t>
-      </w:r>
-    </w:p>
-    <w:p>
-      <w:pPr>
-        <w:spacing w:after="0" w:before="0"/>
-      </w:pPr>
-      <w:r>
-        <w:rPr>
-          <w:rFonts w:ascii="Consolas" w:hAnsi="Consolas"/>
-          <w:sz w:val="17"/>
-        </w:rPr>
-        <w:t xml:space="preserve"> </w:t>
-      </w:r>
-    </w:p>
-    <w:p>
-      <w:pPr>
-        <w:spacing w:after="0" w:before="0"/>
-      </w:pPr>
-      <w:r>
-        <w:rPr>
-          <w:rFonts w:ascii="Consolas" w:hAnsi="Consolas"/>
-          <w:sz w:val="17"/>
-        </w:rPr>
-        <w:t xml:space="preserve">    summary = {"processed": processed, "skipped": skipped, "rejected": rejected}</w:t>
-      </w:r>
-    </w:p>
-    <w:p>
-      <w:pPr>
-        <w:spacing w:after="0" w:before="0"/>
-      </w:pPr>
-      <w:r>
-        <w:rPr>
-          <w:rFonts w:ascii="Consolas" w:hAnsi="Consolas"/>
-          <w:sz w:val="17"/>
-        </w:rPr>
-        <w:t xml:space="preserve">    print(json.dumps(summary))</w:t>
-      </w:r>
-    </w:p>
-    <w:p>
-      <w:pPr>
-        <w:spacing w:after="0" w:before="0"/>
-      </w:pPr>
-      <w:r>
-        <w:rPr>
-          <w:rFonts w:ascii="Consolas" w:hAnsi="Consolas"/>
-          <w:sz w:val="17"/>
-        </w:rPr>
-        <w:t xml:space="preserve">    return summary</w:t>
-      </w:r>
-    </w:p>
-    <w:p>
-      <w:pPr>
-        <w:pStyle w:val="Heading2"/>
-      </w:pPr>
-      <w:r>
-        <w:t>B.2  Webhook contract</w:t>
-      </w:r>
-    </w:p>
-    <w:p>
-      <w:pPr>
-        <w:pStyle w:val="Assessortext"/>
-      </w:pPr>
-      <w:r>
-        <w:t>The single integration point. The LMS (the event producer) calls this; your microservice receives it. All six fields are required; a re-sent event with the same event_id is not duplicated.</w:t>
+        <w:t>The single integration point. The website (the event producer) calls this; your microservice receives it. All six fields are required; a re-sent event with the same event_id is not duplicated.</w:t>
       </w:r>
     </w:p>
     <w:p>

</xml_diff>

<commit_message>
labs: apply region-substitution to CL2 AT2 instruments + CL1 topic01 deck (Learner Lab/us-east-1)
The CL2 AT2 student/assessor instruments and deployment exemplar are generated .docx;
their builders now state the lab deploys to us-east-1 with the
[scenario: ap-south-1 (India) | deploy: us-east-1] token, keeping the "region is the
deploy target, mechanics-not-geography" IaC framing (--region <REGION> -> us-east-1).
CL1 topic01 deck: "Launch the Sandbox environment" -> "AWS Academy Learner Lab".
All three docx + the pptx regenerated and text-verified.

Co-Authored-By: Claude Opus 4.8 <noreply@anthropic.com>
</commit_message>
<xml_diff>
--- a/S1-CL2-Cloud-Disaster-Recovery/assessments/AT2/AT2-Microservice-IaC-Implementation-Assessor.docx
+++ b/S1-CL2-Cloud-Disaster-Recovery/assessments/AT2/AT2-Microservice-IaC-Implementation-Assessor.docx
@@ -699,7 +699,7 @@
               <w:pStyle w:val="Assessortext"/>
             </w:pPr>
             <w:r>
-              <w:t>• The AWS Academy Learner Lab for the build (the deployment region is confirmed and advised before the assessment runs - see Conditions).</w:t>
+              <w:t>• The AWS Academy Learner Lab for the build (deploy to us-east-1; see Conditions).</w:t>
             </w:r>
           </w:p>
           <w:p>
@@ -865,7 +865,7 @@
           <w:p>
             <w:pPr/>
             <w:r>
-              <w:t>C2 - AWS Academy Learner Lab access is available for the student to build, deploy and test. The deployment region is confirmed and advised to students before the assessment runs.</w:t>
+              <w:t>C2 - AWS Academy Learner Lab access is available for the student to build, deploy and test. The lab deploys to us-east-1 (the single region the Learner Lab offers).</w:t>
             </w:r>
           </w:p>
           <w:p>
@@ -877,7 +877,7 @@
           <w:p>
             <w:pPr/>
             <w:r>
-              <w:t>C4 - Design context: the AT1 design places the audit store in the India region (ap-south-1) for data residency. The deployment region in the lab is the lab's (advised before the build); the region is the deploy target (the --region flag on the deploy command), not a template parameter, so the same template targets the lab region or production. The mechanics are assessed, not the geography.</w:t>
+              <w:t>C4 - Design context: the AT1 design places the audit store in the India region (ap-south-1) for data residency. In the lab you deploy to us-east-1 - [scenario: ap-south-1 (India) | deploy: us-east-1] - because the region is the deploy target (the --region flag on the deploy command), not a template parameter, so the same template targets us-east-1 in the lab or ap-south-1 in production. The mechanics are assessed, not the geography.</w:t>
             </w:r>
           </w:p>
           <w:p>
@@ -1445,7 +1445,7 @@
         <w:pStyle w:val="Assessortext"/>
       </w:pPr>
       <w:r>
-        <w:t>Lab environment: the AWS Academy Learner Lab (and the deployment region) will be advised before you start. The AT1 design places the store in India (ap-south-1) for residency; the deployment region is the deploy target (the --region flag), so the same template deploys to the lab region or production - parameterise environment-specific values (e.g. EnvName), not the region.</w:t>
+        <w:t>Lab environment: build in the AWS Academy Learner Lab and deploy to us-east-1. The AT1 design places the store in India (ap-south-1) for residency - [scenario: ap-south-1 (India) | deploy: us-east-1] - but the region is the deploy target (the --region flag), so the same template deploys to us-east-1 in the lab or ap-south-1 in production; parameterise environment-specific values (e.g. EnvName), not the region.</w:t>
       </w:r>
     </w:p>
     <w:p>
@@ -2265,7 +2265,7 @@
         <w:pStyle w:val="Heading2"/>
       </w:pPr>
       <w:r>
-        <w:t>How to operate it (the region will be advised - substitute it for &lt;REGION&gt;):</w:t>
+        <w:t>How to operate it (deploy to us-east-1 in the lab; in production this region would be ap-south-1):</w:t>
       </w:r>
     </w:p>
     <w:p>
@@ -2313,7 +2313,7 @@
           <w:rFonts w:ascii="Consolas" w:hAnsi="Consolas"/>
           <w:sz w:val="17"/>
         </w:rPr>
-        <w:t>aws cloudformation deploy --region &lt;REGION&gt; \</w:t>
+        <w:t>aws cloudformation deploy --region us-east-1 \</w:t>
       </w:r>
     </w:p>
     <w:p>
@@ -2397,7 +2397,7 @@
           <w:rFonts w:ascii="Consolas" w:hAnsi="Consolas"/>
           <w:sz w:val="17"/>
         </w:rPr>
-        <w:t>aws cloudformation delete-stack --region &lt;REGION&gt; --stack-name yat-audit-store</w:t>
+        <w:t>aws cloudformation delete-stack --region us-east-1 --stack-name yat-audit-store</w:t>
       </w:r>
     </w:p>
     <w:p>

</xml_diff>